<commit_message>
fix: separate tenure from senior-leadership scope in resume summaries
Previous executive summaries implied 17 years of program leadership at
the 352-person scale. Reality:
- 8 years (2008-2016): Systems Analyst / Coordinator / Claims Rep
- 5+ years (2016-2022): IT Project Manager (FAC-P/PM, $200M+ portfolios)
- 3+ years (2022-2025): Branch Chief (352-person org, 170 offices, 99.9%)

Each of the 5 summaries now states "17 years federal IT at SSA,
culminating in three years as Branch Chief..." (or equivalent), with
Program-PM specifying "Nine years of federal IT leadership at SSA —
five as IT Project Manager, three as Branch Chief."

Regenerated all 5 PDFs accordingly.

Co-Authored-By: Claude Opus 4.7 (1M context) <noreply@anthropic.com>
</commit_message>
<xml_diff>
--- a/public/resumes/Jordan-Henning-Resume-Brief.docx
+++ b/public/resumes/Jordan-Henning-Resume-Brief.docx
@@ -200,7 +200,7 @@
           <w:color w:val="1A1F2C"/>
           <w:sz w:val="22"/>
         </w:rPr>
-        <w:t>17+ years federal program leadership at enterprise scale (352-person org, 170 offices, 99.9% availability, $200M+ portfolio)</w:t>
+        <w:t>17 years federal IT at SSA</w:t>
       </w:r>
       <w:r>
         <w:rPr>
@@ -210,7 +210,27 @@
           <w:color w:val="1A1F2C"/>
           <w:sz w:val="22"/>
         </w:rPr>
-        <w:t xml:space="preserve">, layered with two production multi-agent AI systems I designed, coded, and operate myself: </w:t>
+        <w:t xml:space="preserve"> — most recently three years as </w:t>
+      </w:r>
+      <w:r>
+        <w:rPr>
+          <w:rFonts w:ascii="Calibri" w:hAnsi="Calibri" w:cs="Calibri" w:eastAsia="Calibri"/>
+          <w:b/>
+          <w:i w:val="0"/>
+          <w:color w:val="1A1F2C"/>
+          <w:sz w:val="22"/>
+        </w:rPr>
+        <w:t>Branch Chief over a 352-person organization (170 offices, 99.9% availability, $200M+ portfolio)</w:t>
+      </w:r>
+      <w:r>
+        <w:rPr>
+          <w:rFonts w:ascii="Calibri" w:hAnsi="Calibri" w:cs="Calibri" w:eastAsia="Calibri"/>
+          <w:b w:val="0"/>
+          <w:i w:val="0"/>
+          <w:color w:val="1A1F2C"/>
+          <w:sz w:val="22"/>
+        </w:rPr>
+        <w:t xml:space="preserve">. FAC-P/PM certified. Public Trust cleared. Layered with two production multi-agent AI systems I designed, coded, and operate myself: </w:t>
       </w:r>
       <w:r>
         <w:rPr>
@@ -250,7 +270,7 @@
           <w:color w:val="1A1F2C"/>
           <w:sz w:val="22"/>
         </w:rPr>
-        <w:t xml:space="preserve"> (autonomous multi-agent trading, live since Feb 2026, 62% win rate over ~500 trades). Public Trust cleared. FAC-P/PM certified. Combat veteran, 101st Airborne (Bronze Star, Purple Heart). Targeting </w:t>
+        <w:t xml:space="preserve"> (autonomous multi-agent trading, live since Feb 2026, 62% win rate over ~500 trades). Combat veteran, 101st Airborne (Bronze Star, Purple Heart). Targeting </w:t>
       </w:r>
       <w:r>
         <w:rPr>

</xml_diff>

<commit_message>
fix: make Branch Chief org structure transparent everywhere
Previous "352-person organization" framing implied 352 direct reports.
Reality: manager-of-managers structure with 12 direct reports overseeing
340 field IT staff embedded across 170 SSA Hearings Offices, delivering
IT services to 7,000+ Hearings Office employees as the customer base.

Updated everywhere — site (data files, layout meta), chatbot (system
prompt: positioning + scope + pushback handlers), and resume script
(all 5 summaries + headline outcomes + Branch Chief lead line).

Adds the 7,000+ employees-served context as the genuine customer-base
metric. Keeps the 352 number on the metric tile (real total under
manager-of-managers convention) but the label/detail are now explicit:
"Federal IT operation led / Manager-of-managers as Branch Chief..."

Regenerated all 5 PDFs accordingly.

Co-Authored-By: Claude Opus 4.7 (1M context) <noreply@anthropic.com>
</commit_message>
<xml_diff>
--- a/public/resumes/Jordan-Henning-Resume-Brief.docx
+++ b/public/resumes/Jordan-Henning-Resume-Brief.docx
@@ -220,7 +220,7 @@
           <w:color w:val="1A1F2C"/>
           <w:sz w:val="22"/>
         </w:rPr>
-        <w:t>Branch Chief over a 352-person organization (170 offices, 99.9% availability, $200M+ portfolio)</w:t>
+        <w:t>Branch Chief: manager-of-managers over 12 direct + 340 field IT across 170 offices serving 7,000+ employees (99.9% availability, $200M+ portfolio)</w:t>
       </w:r>
       <w:r>
         <w:rPr>
@@ -359,7 +359,7 @@
           <w:color w:val="1A1F2C"/>
           <w:sz w:val="22"/>
         </w:rPr>
-        <w:t>352-person federal IT service organization</w:t>
+        <w:t>Manager-of-managers as Branch Chief</w:t>
       </w:r>
       <w:r>
         <w:rPr>
@@ -369,7 +369,7 @@
           <w:color w:val="1A1F2C"/>
           <w:sz w:val="22"/>
         </w:rPr>
-        <w:t xml:space="preserve"> led across 170 nationwide offices at </w:t>
+        <w:t xml:space="preserve"> — 12 direct reports + 340 field IT across 170 nationwide offices serving 7,000+ employees at </w:t>
       </w:r>
       <w:r>
         <w:rPr>

</xml_diff>

<commit_message>
Correct résumé/site claims to verified ground truth
Span of control: drop "352-person org" / "manager-of-managers over 340"; reframe
as 12 direct reports (incl. 2 team leads) with IT governance/policy authority over
a 340-technician field operation. Portfolio: $200M is cumulative IT-PM project
value, not a standing or Branch Chief portfolio. Military: one combat tour in Iraq
(Bronze Star, Purple Heart) — remove "three tours"/Afghanistan. Futures Bot: remove
unverifiable performance claims; reframe as a personal multi-agent build. Add
Shadow Edge Tools + Marketing Ops Console builds and AWS Certified AI Practitioner
(2026). Regenerate all downloadable résumés (docx + pdf) from the corrected source;
remove stale orphan PDF.

Co-Authored-By: Claude Opus 4.8 (1M context) <noreply@anthropic.com>
</commit_message>
<xml_diff>
--- a/public/resumes/Jordan-Henning-Resume-Brief.docx
+++ b/public/resumes/Jordan-Henning-Resume-Brief.docx
@@ -220,7 +220,7 @@
           <w:color w:val="1A1F2C"/>
           <w:sz w:val="22"/>
         </w:rPr>
-        <w:t>Branch Chief: manager-of-managers over 12 direct + 340 field IT across 170 offices serving 7,000+ employees (99.9% availability, $200M+ portfolio)</w:t>
+        <w:t>Branch Chief: 12 direct reports (incl. 2 team leads) with governance over a 340-technician field operation across 170 offices serving 7,000+ employees at 99.9% availability</w:t>
       </w:r>
       <w:r>
         <w:rPr>
@@ -230,7 +230,7 @@
           <w:color w:val="1A1F2C"/>
           <w:sz w:val="22"/>
         </w:rPr>
-        <w:t xml:space="preserve">. FAC-P/PM certified. Public Trust cleared. Layered with two production multi-agent AI systems I designed, coded, and operate myself: </w:t>
+        <w:t xml:space="preserve">. FAC-P/PM and AWS Certified AI Practitioner. Public Trust cleared. Layered with production multi-agent AI systems I designed, coded, and operate myself: </w:t>
       </w:r>
       <w:r>
         <w:rPr>
@@ -270,7 +270,7 @@
           <w:color w:val="1A1F2C"/>
           <w:sz w:val="22"/>
         </w:rPr>
-        <w:t xml:space="preserve"> (autonomous multi-agent trading, live since Feb 2026, 62% win rate over ~500 trades). Combat veteran, 101st Airborne (Bronze Star, Purple Heart). Targeting </w:t>
+        <w:t xml:space="preserve"> (a personal multi-agent trading desk built end-to-end). Combat veteran, 101st Airborne — one combat tour in Iraq (Bronze Star, Purple Heart). Targeting </w:t>
       </w:r>
       <w:r>
         <w:rPr>
@@ -359,7 +359,7 @@
           <w:color w:val="1A1F2C"/>
           <w:sz w:val="22"/>
         </w:rPr>
-        <w:t>Manager-of-managers as Branch Chief</w:t>
+        <w:t>Federal IT leadership as Branch Chief</w:t>
       </w:r>
       <w:r>
         <w:rPr>
@@ -369,7 +369,7 @@
           <w:color w:val="1A1F2C"/>
           <w:sz w:val="22"/>
         </w:rPr>
-        <w:t xml:space="preserve"> — 12 direct reports + 340 field IT across 170 nationwide offices serving 7,000+ employees at </w:t>
+        <w:t xml:space="preserve"> — 12 direct reports (incl. 2 team leads), governance over a 340-technician field operation across 170 nationwide offices serving 7,000+ employees at </w:t>
       </w:r>
       <w:r>
         <w:rPr>
@@ -405,7 +405,7 @@
           <w:color w:val="1A1F2C"/>
           <w:sz w:val="22"/>
         </w:rPr>
-        <w:t>$200M+ Agile IT portfolio</w:t>
+        <w:t>$200M+ in IT projects delivered</w:t>
       </w:r>
       <w:r>
         <w:rPr>
@@ -415,7 +415,7 @@
           <w:color w:val="1A1F2C"/>
           <w:sz w:val="22"/>
         </w:rPr>
-        <w:t xml:space="preserve"> delivered on-time, under-budget over multi-year federal programs</w:t>
+        <w:t xml:space="preserve"> cumulatively as IT Project Manager — on-time, under-budget over a 5-year tenure</w:t>
       </w:r>
     </w:p>
     <w:p>
@@ -978,7 +978,7 @@
           <w:color w:val="1A1F2C"/>
           <w:sz w:val="22"/>
         </w:rPr>
-        <w:t xml:space="preserve"> across three-year tenure as manager-of-managers (12 direct, 340 indirect reports).</w:t>
+        <w:t xml:space="preserve"> across three-year tenure (12 direct reports, incl. 2 team leads; governance over a 340-technician field operation).</w:t>
       </w:r>
     </w:p>
     <w:p>
@@ -1307,7 +1307,7 @@
           <w:color w:val="1A1F2C"/>
           <w:sz w:val="22"/>
         </w:rPr>
-        <w:t xml:space="preserve"> (2001–2009) — three combat tours (Iraq, Afghanistan), Bronze Star, Purple Heart.  ·  </w:t>
+        <w:t xml:space="preserve"> (2001–2009) — one combat tour (Iraq), Bronze Star, Purple Heart.  ·  </w:t>
       </w:r>
       <w:r>
         <w:rPr>
@@ -1485,6 +1485,42 @@
           <w:sz w:val="22"/>
         </w:rPr>
         <w:t xml:space="preserve">  ·  2020  ·  Federal Acquisition Institute</w:t>
+      </w:r>
+    </w:p>
+    <w:p>
+      <w:pPr>
+        <w:spacing w:before="0" w:after="40" w:line="276" w:lineRule="auto"/>
+        <w:ind w:left="360" w:hanging="259"/>
+      </w:pPr>
+      <w:r>
+        <w:rPr>
+          <w:rFonts w:ascii="Calibri" w:hAnsi="Calibri" w:cs="Calibri" w:eastAsia="Calibri"/>
+          <w:b/>
+          <w:i w:val="0"/>
+          <w:color w:val="1F4E8C"/>
+          <w:sz w:val="22"/>
+        </w:rPr>
+        <w:t xml:space="preserve">•  </w:t>
+      </w:r>
+      <w:r>
+        <w:rPr>
+          <w:rFonts w:ascii="Calibri" w:hAnsi="Calibri" w:cs="Calibri" w:eastAsia="Calibri"/>
+          <w:b/>
+          <w:i w:val="0"/>
+          <w:color w:val="1A1F2C"/>
+          <w:sz w:val="22"/>
+        </w:rPr>
+        <w:t>AWS Certified AI Practitioner</w:t>
+      </w:r>
+      <w:r>
+        <w:rPr>
+          <w:rFonts w:ascii="Calibri" w:hAnsi="Calibri" w:cs="Calibri" w:eastAsia="Calibri"/>
+          <w:b w:val="0"/>
+          <w:i w:val="0"/>
+          <w:color w:val="1A1F2C"/>
+          <w:sz w:val="22"/>
+        </w:rPr>
+        <w:t xml:space="preserve">  ·  2026  ·  Amazon Web Services</w:t>
       </w:r>
     </w:p>
     <w:p>

</xml_diff>

<commit_message>
Remove Bronze Star / Purple Heart references
Not on DD-214; removed from site copy, SEO/schema metadata, timeline,
awards list, and the résumé generator. Kept the combat-veteran / 101st
Airborne / one-combat-tour-in-Iraq narrative. Corrected a stale
"3 Combat tours" stat badge to "1 Combat tour · Iraq". Regenerated all
five résumé .docx/.pdf variants (LibreOffice) — verified 0 award refs.

Co-Authored-By: Claude Opus 4.8 <noreply@anthropic.com>
</commit_message>
<xml_diff>
--- a/public/resumes/Jordan-Henning-Resume-Brief.docx
+++ b/public/resumes/Jordan-Henning-Resume-Brief.docx
@@ -270,7 +270,7 @@
           <w:color w:val="1A1F2C"/>
           <w:sz w:val="22"/>
         </w:rPr>
-        <w:t xml:space="preserve"> (a personal multi-agent trading desk built end-to-end). Combat veteran, 101st Airborne — one combat tour in Iraq (Bronze Star, Purple Heart). Targeting </w:t>
+        <w:t xml:space="preserve"> (a personal multi-agent trading desk built end-to-end). Combat veteran, 101st Airborne — one combat tour in Iraq. Targeting </w:t>
       </w:r>
       <w:r>
         <w:rPr>
@@ -1307,7 +1307,7 @@
           <w:color w:val="1A1F2C"/>
           <w:sz w:val="22"/>
         </w:rPr>
-        <w:t xml:space="preserve"> (2001–2009) — one combat tour (Iraq), Bronze Star, Purple Heart.  ·  </w:t>
+        <w:t xml:space="preserve"> (2001–2009) — one combat tour (Iraq).  ·  </w:t>
       </w:r>
       <w:r>
         <w:rPr>
@@ -1377,78 +1377,6 @@
           <w:sz w:val="22"/>
         </w:rPr>
         <w:t xml:space="preserve">  ·  2021  ·  Presented by Acting Commissioner Kilolo Kijakazi for COVID-19 emergency document upload delivery</w:t>
-      </w:r>
-    </w:p>
-    <w:p>
-      <w:pPr>
-        <w:spacing w:before="0" w:after="40" w:line="276" w:lineRule="auto"/>
-        <w:ind w:left="360" w:hanging="259"/>
-      </w:pPr>
-      <w:r>
-        <w:rPr>
-          <w:rFonts w:ascii="Calibri" w:hAnsi="Calibri" w:cs="Calibri" w:eastAsia="Calibri"/>
-          <w:b/>
-          <w:i w:val="0"/>
-          <w:color w:val="1F4E8C"/>
-          <w:sz w:val="22"/>
-        </w:rPr>
-        <w:t xml:space="preserve">•  </w:t>
-      </w:r>
-      <w:r>
-        <w:rPr>
-          <w:rFonts w:ascii="Calibri" w:hAnsi="Calibri" w:cs="Calibri" w:eastAsia="Calibri"/>
-          <w:b/>
-          <w:i w:val="0"/>
-          <w:color w:val="1A1F2C"/>
-          <w:sz w:val="22"/>
-        </w:rPr>
-        <w:t>Bronze Star</w:t>
-      </w:r>
-      <w:r>
-        <w:rPr>
-          <w:rFonts w:ascii="Calibri" w:hAnsi="Calibri" w:cs="Calibri" w:eastAsia="Calibri"/>
-          <w:b w:val="0"/>
-          <w:i w:val="0"/>
-          <w:color w:val="1A1F2C"/>
-          <w:sz w:val="22"/>
-        </w:rPr>
-        <w:t xml:space="preserve">  ·  2006  ·  U.S. Army (Iraq combat tour)</w:t>
-      </w:r>
-    </w:p>
-    <w:p>
-      <w:pPr>
-        <w:spacing w:before="0" w:after="40" w:line="276" w:lineRule="auto"/>
-        <w:ind w:left="360" w:hanging="259"/>
-      </w:pPr>
-      <w:r>
-        <w:rPr>
-          <w:rFonts w:ascii="Calibri" w:hAnsi="Calibri" w:cs="Calibri" w:eastAsia="Calibri"/>
-          <w:b/>
-          <w:i w:val="0"/>
-          <w:color w:val="1F4E8C"/>
-          <w:sz w:val="22"/>
-        </w:rPr>
-        <w:t xml:space="preserve">•  </w:t>
-      </w:r>
-      <w:r>
-        <w:rPr>
-          <w:rFonts w:ascii="Calibri" w:hAnsi="Calibri" w:cs="Calibri" w:eastAsia="Calibri"/>
-          <w:b/>
-          <w:i w:val="0"/>
-          <w:color w:val="1A1F2C"/>
-          <w:sz w:val="22"/>
-        </w:rPr>
-        <w:t>Purple Heart</w:t>
-      </w:r>
-      <w:r>
-        <w:rPr>
-          <w:rFonts w:ascii="Calibri" w:hAnsi="Calibri" w:cs="Calibri" w:eastAsia="Calibri"/>
-          <w:b w:val="0"/>
-          <w:i w:val="0"/>
-          <w:color w:val="1A1F2C"/>
-          <w:sz w:val="22"/>
-        </w:rPr>
-        <w:t xml:space="preserve">  ·  2006  ·  U.S. Army</w:t>
       </w:r>
     </w:p>
     <w:p>

</xml_diff>